<commit_message>
refactor(licenta): update real hardware specs to i3-10100F and redesign banking kiosk to obsidian theme
</commit_message>
<xml_diff>
--- a/licenta/LL3-LucrareLicenta/LUCRARE LICENTA - 31.08.2026.docx
+++ b/licenta/LL3-LucrareLicenta/LUCRARE LICENTA - 31.08.2026.docx
@@ -1792,7 +1792,7 @@
           <w:rFonts w:ascii="Times New Roman" w:hAnsi="Times New Roman"/>
           <w:sz w:val="24"/>
         </w:rPr>
-        <w:t>Metodologia de cercetare adoptată îmbină analiza teoretică și normativă a literaturii de specialitate cu o abordare cantitativă experimentală. Întreaga arhitectură a fost instanțiată pe un server fizic x86_64 dedicat (procesor Intel Core i9-13900H cu 14 nuclee / 20 fire de execuție, 64 GB memorie RAM DDR5 și subsistem de stocare NVMe ZFS). Toate componentele software au fost dezvoltate în limbajul Python 3, utilizând cadre de lucru moderne (FastAPI, SQLite/PostgreSQL, hashlib) și au fost supuse unor teste de penetrare automate riguroase, asigurând reproductibilitatea completă a rezultatelor obținute.</w:t>
+        <w:t>Metodologia de cercetare adoptată îmbină analiza teoretică și normativă a literaturii de specialitate cu o abordare cantitativă experimentală. Întreaga arhitectură a fost instanțiată pe nodul fizic de calcul x86_64 bare-metal al infrastructurii de laborator (procesor Intel Core i3-10100F cu 4 nuclee fizice / 8 fire de execuție la 4.30 GHz Turbo, 12 GB memorie RAM DDR4 completată cu subsistem dinamic ZRAM de 6.0 GB lz4 și subsistem de stocare de 512 GB SSD LVM-Thin sub Proxmox VE 9.2). Toate componentele software au fost dezvoltate în limbajul Python 3, utilizând cadre de lucru moderne (FastAPI, SQLite/PostgreSQL, hashlib) și au fost supuse unor teste de penetrare automate riguroase, asigurând reproductibilitatea completă a rezultatelor obținute.</w:t>
       </w:r>
     </w:p>
     <w:p>
@@ -4609,7 +4609,7 @@
           <w:rFonts w:ascii="Times New Roman" w:hAnsi="Times New Roman"/>
           <w:sz w:val="24"/>
         </w:rPr>
-        <w:t>Infrastructura de calcul a fost implementată pe platforma de virtualizare de nivel întreprindere Proxmox Virtual Environment (PVE) versiunea 9.2, instalată bare-metal pe un server de calcul fizic de înaltă densitate Minisforum MS-01. Serverul este echipat cu un procesor Intel Core i9-13900H (14 nuclee fizice, 20 fire de execuție, frecvență turbo de până la 5.4 GHz), 64 GB de memorie RAM DDR5 la 5200 MHz și o matrice de stocare de mare viteză configurată în sistem de fișiere ZFS pe SSD-uri NVMe PCIe 4.0.</w:t>
+        <w:t>Infrastructura de calcul a fost implementată pe platforma de virtualizare de nivel întreprindere Proxmox Virtual Environment (PVE) versiunea 9.2 (nucleu Linux 7.0 pve), instalată bare-metal pe nodul fizic x86_64 primar al laboratorului (pve). Serverul este echipat cu un procesor Intel Core i3-10100F (4 nuclee fizice, 8 fire de execuție, frecvență de bază 3.60 GHz și până la 4.30 GHz Turbo, 6 MB Smart Cache), 12 GB de memorie RAM DDR4 la 2133 MHz (12.288 MB), o placă grafică dedicată NVIDIA GeForce GTX 1050 Ti (4 GB VRAM GDDR5), un subsistem de stocare de 512 GB SSD (gestionat printr-un pool LVM-Thin de mare viteză) și un modul ZRAM de 6.0 GB (/dev/zram0, compresie lz4, swappiness 60) ce garantează densitatea ridicată a sarcinilor de lucru și previne degradarea mediilor SSD prin VirtIO Memory Ballooning.</w:t>
       </w:r>
     </w:p>
     <w:p>
@@ -4623,7 +4623,7 @@
           <w:rFonts w:ascii="Times New Roman" w:hAnsi="Times New Roman"/>
           <w:sz w:val="24"/>
         </w:rPr>
-        <w:t>Platforma Proxmox VE oferă o combinație optimă între mașini virtuale complete bazate pe KVM (Kernel-based Virtual Machine) – utilizate pentru nodurile care necesită izolare strictă la nivel de nucleu al sistemului de operare – și containere ușoare bazate pe nucleu Linux (LXC – Linux Containers) – utilizate pentru microserviciile cu rată ridicată de tranzacționare. Pentru eficientizarea consumului de memorie și garantarea disponibilității în perioadele de vârf tranzacțional, mașinile virtuale au fost configurate cu alocare dinamică de memorie (Memory Ballooning via virtio-balloon).</w:t>
+        <w:t>Platforma Proxmox VE oferă o combinație optimă între mașini virtuale complete bazate pe KVM (Kernel-based Virtual Machine) – utilizate pentru nodurile care necesită izolare strictă la nivel de nucleu al sistemului de operare – și containere ușoare bazate pe nucleu Linux (LXC – Linux Containers) – utilizate pentru microserviciile cu rată ridicată de tranzacționare și platforma SIEM Wazuh. Pentru eficientizarea consumului de memorie și garantarea disponibilității în perioadele de vârf tranzacțional, mașinile virtuale au fost configurate cu alocare dinamică de memorie (Memory Ballooning via virtio-balloon).</w:t>
       </w:r>
     </w:p>
     <w:p>
@@ -4638,7 +4638,7 @@
           <w:b/>
           <w:sz w:val="22"/>
         </w:rPr>
-        <w:t>Tabelul 2.1: Specificațiile tehnice și alocarea resurselor pentru activele virtualizate din clusterul Proxmox VE 9.2</w:t>
+        <w:t>Tabelul 2.1: Specificațiile tehnice și alocarea resurselor pentru activele virtualizate din nodul fizic Proxmox VE 9.2</w:t>
       </w:r>
     </w:p>
     <w:tbl>
@@ -4781,7 +4781,7 @@
                 <w:b/>
                 <w:sz w:val="20"/>
               </w:rPr>
-              <w:t>Stocare ZFS</w:t>
+              <w:t>Stocare LVM</w:t>
             </w:r>
           </w:p>
         </w:tc>
@@ -4893,7 +4893,7 @@
                 <w:rFonts w:ascii="Times New Roman" w:hAnsi="Times New Roman"/>
                 <w:sz w:val="20"/>
               </w:rPr>
-              <w:t>2 vCPU / 4 GB (fix)</w:t>
+              <w:t>2 vCPU / 1024 MB (512MB balloon)</w:t>
             </w:r>
           </w:p>
         </w:tc>
@@ -4929,7 +4929,7 @@
                 <w:rFonts w:ascii="Times New Roman" w:hAnsi="Times New Roman"/>
                 <w:sz w:val="20"/>
               </w:rPr>
-              <w:t>Firewall de frontieră, gateway inter-VLAN, IDS</w:t>
+              <w:t>Firewall de frontieră, gateway inter-VLAN, IDS Suricata</w:t>
             </w:r>
           </w:p>
         </w:tc>
@@ -5021,7 +5021,7 @@
                 <w:rFonts w:ascii="Times New Roman" w:hAnsi="Times New Roman"/>
                 <w:sz w:val="20"/>
               </w:rPr>
-              <w:t>2 vCPU / 4 GB (2GB balloon)</w:t>
+              <w:t>2 vCPU / 2048 MB (1024MB balloon)</w:t>
             </w:r>
           </w:p>
         </w:tc>
@@ -5057,7 +5057,7 @@
                 <w:rFonts w:ascii="Times New Roman" w:hAnsi="Times New Roman"/>
                 <w:sz w:val="20"/>
               </w:rPr>
-              <w:t>Motor central Core-Banking, ledger în partidă dublă</w:t>
+              <w:t>Motor central Core-Banking, ledger în partidă dublă SHA-256</w:t>
             </w:r>
           </w:p>
         </w:tc>
@@ -5149,7 +5149,7 @@
                 <w:rFonts w:ascii="Times New Roman" w:hAnsi="Times New Roman"/>
                 <w:sz w:val="20"/>
               </w:rPr>
-              <w:t>2 vCPU / 4 GB (2GB balloon)</w:t>
+              <w:t>2 vCPU / 2048 MB (1024MB balloon)</w:t>
             </w:r>
           </w:p>
         </w:tc>
@@ -5185,7 +5185,7 @@
                 <w:rFonts w:ascii="Times New Roman" w:hAnsi="Times New Roman"/>
                 <w:sz w:val="20"/>
               </w:rPr>
-              <w:t>Server bază de date financiară PostgreSQL + Wazuh</w:t>
+              <w:t>Server bază de date financiară PostgreSQL + reconciliere</w:t>
             </w:r>
           </w:p>
         </w:tc>
@@ -5277,7 +5277,7 @@
                 <w:rFonts w:ascii="Times New Roman" w:hAnsi="Times New Roman"/>
                 <w:sz w:val="20"/>
               </w:rPr>
-              <w:t>1 vCPU / 1 GB (fix)</w:t>
+              <w:t>1 vCPU / 1024 MB (fix)</w:t>
             </w:r>
           </w:p>
         </w:tc>
@@ -5313,7 +5313,7 @@
                 <w:rFonts w:ascii="Times New Roman" w:hAnsi="Times New Roman"/>
                 <w:sz w:val="20"/>
               </w:rPr>
-              <w:t>Microserviciu plăți rapide card &amp; SWIFT ISO 20022</w:t>
+              <w:t>Microserviciu plăți rapide card (Luhn) &amp; ISO 20022 pacs.008</w:t>
             </w:r>
           </w:p>
         </w:tc>
@@ -5405,7 +5405,7 @@
                 <w:rFonts w:ascii="Times New Roman" w:hAnsi="Times New Roman"/>
                 <w:sz w:val="20"/>
               </w:rPr>
-              <w:t>2 vCPU / 2 GB (1GB balloon)</w:t>
+              <w:t>2 vCPU / 1024 MB (512MB balloon)</w:t>
             </w:r>
           </w:p>
         </w:tc>
@@ -5441,7 +5441,135 @@
                 <w:rFonts w:ascii="Times New Roman" w:hAnsi="Times New Roman"/>
                 <w:sz w:val="20"/>
               </w:rPr>
-              <w:t>Bastion administrativ unic, SSH Ed25519 + MFA</w:t>
+              <w:t>Bastion administrativ unic, SSH Ed25519 + MFA TOTP</w:t>
+            </w:r>
+          </w:p>
+        </w:tc>
+      </w:tr>
+      <w:tr>
+        <w:tc>
+          <w:tcPr>
+            <w:tcW w:type="dxa" w:w="1296"/>
+          </w:tcPr>
+          <w:p>
+            <w:pPr>
+              <w:spacing w:before="40" w:after="40"/>
+              <w:jc w:val="left"/>
+            </w:pPr>
+            <w:r>
+              <w:rPr>
+                <w:rFonts w:ascii="Times New Roman" w:hAnsi="Times New Roman"/>
+                <w:sz w:val="20"/>
+              </w:rPr>
+              <w:t>CT 106</w:t>
+            </w:r>
+          </w:p>
+        </w:tc>
+        <w:tc>
+          <w:tcPr>
+            <w:tcW w:type="dxa" w:w="1296"/>
+          </w:tcPr>
+          <w:p>
+            <w:pPr>
+              <w:spacing w:before="40" w:after="40"/>
+              <w:jc w:val="left"/>
+            </w:pPr>
+            <w:r>
+              <w:rPr>
+                <w:rFonts w:ascii="Times New Roman" w:hAnsi="Times New Roman"/>
+                <w:sz w:val="20"/>
+              </w:rPr>
+              <w:t>wazuh-siem-licenta</w:t>
+            </w:r>
+          </w:p>
+        </w:tc>
+        <w:tc>
+          <w:tcPr>
+            <w:tcW w:type="dxa" w:w="1296"/>
+          </w:tcPr>
+          <w:p>
+            <w:pPr>
+              <w:spacing w:before="40" w:after="40"/>
+              <w:jc w:val="left"/>
+            </w:pPr>
+            <w:r>
+              <w:rPr>
+                <w:rFonts w:ascii="Times New Roman" w:hAnsi="Times New Roman"/>
+                <w:sz w:val="20"/>
+              </w:rPr>
+              <w:t>LXC (pve)</w:t>
+            </w:r>
+          </w:p>
+        </w:tc>
+        <w:tc>
+          <w:tcPr>
+            <w:tcW w:type="dxa" w:w="1296"/>
+          </w:tcPr>
+          <w:p>
+            <w:pPr>
+              <w:spacing w:before="40" w:after="40"/>
+              <w:jc w:val="left"/>
+            </w:pPr>
+            <w:r>
+              <w:rPr>
+                <w:rFonts w:ascii="Times New Roman" w:hAnsi="Times New Roman"/>
+                <w:sz w:val="20"/>
+              </w:rPr>
+              <w:t>Ubuntu 24.04 LTS</w:t>
+            </w:r>
+          </w:p>
+        </w:tc>
+        <w:tc>
+          <w:tcPr>
+            <w:tcW w:type="dxa" w:w="1296"/>
+          </w:tcPr>
+          <w:p>
+            <w:pPr>
+              <w:spacing w:before="40" w:after="40"/>
+              <w:jc w:val="left"/>
+            </w:pPr>
+            <w:r>
+              <w:rPr>
+                <w:rFonts w:ascii="Times New Roman" w:hAnsi="Times New Roman"/>
+                <w:sz w:val="20"/>
+              </w:rPr>
+              <w:t>4 vCPU / 6144 MB (4GB Heap)</w:t>
+            </w:r>
+          </w:p>
+        </w:tc>
+        <w:tc>
+          <w:tcPr>
+            <w:tcW w:type="dxa" w:w="1296"/>
+          </w:tcPr>
+          <w:p>
+            <w:pPr>
+              <w:spacing w:before="40" w:after="40"/>
+              <w:jc w:val="left"/>
+            </w:pPr>
+            <w:r>
+              <w:rPr>
+                <w:rFonts w:ascii="Times New Roman" w:hAnsi="Times New Roman"/>
+                <w:sz w:val="20"/>
+              </w:rPr>
+              <w:t>35 GB rootfs</w:t>
+            </w:r>
+          </w:p>
+        </w:tc>
+        <w:tc>
+          <w:tcPr>
+            <w:tcW w:type="dxa" w:w="1296"/>
+          </w:tcPr>
+          <w:p>
+            <w:pPr>
+              <w:spacing w:before="40" w:after="40"/>
+              <w:jc w:val="left"/>
+            </w:pPr>
+            <w:r>
+              <w:rPr>
+                <w:rFonts w:ascii="Times New Roman" w:hAnsi="Times New Roman"/>
+                <w:sz w:val="20"/>
+              </w:rPr>
+              <w:t>Platformă centrală SIEM/XDR, OpenSearch Indexer &amp; Dashboard</w:t>
             </w:r>
           </w:p>
         </w:tc>
@@ -5533,7 +5661,7 @@
                 <w:rFonts w:ascii="Times New Roman" w:hAnsi="Times New Roman"/>
                 <w:sz w:val="20"/>
               </w:rPr>
-              <w:t>2 vCPU / 2 GB (fix)</w:t>
+              <w:t>2 vCPU / 1024 MB (fix)</w:t>
             </w:r>
           </w:p>
         </w:tc>
@@ -5569,135 +5697,7 @@
                 <w:rFonts w:ascii="Times New Roman" w:hAnsi="Times New Roman"/>
                 <w:sz w:val="20"/>
               </w:rPr>
-              <w:t>Terminal tranzacțional securizat casierie/kiosk</w:t>
-            </w:r>
-          </w:p>
-        </w:tc>
-      </w:tr>
-      <w:tr>
-        <w:tc>
-          <w:tcPr>
-            <w:tcW w:type="dxa" w:w="1296"/>
-          </w:tcPr>
-          <w:p>
-            <w:pPr>
-              <w:spacing w:before="40" w:after="40"/>
-              <w:jc w:val="left"/>
-            </w:pPr>
-            <w:r>
-              <w:rPr>
-                <w:rFonts w:ascii="Times New Roman" w:hAnsi="Times New Roman"/>
-                <w:sz w:val="20"/>
-              </w:rPr>
-              <w:t>VM 302</w:t>
-            </w:r>
-          </w:p>
-        </w:tc>
-        <w:tc>
-          <w:tcPr>
-            <w:tcW w:type="dxa" w:w="1296"/>
-          </w:tcPr>
-          <w:p>
-            <w:pPr>
-              <w:spacing w:before="40" w:after="40"/>
-              <w:jc w:val="left"/>
-            </w:pPr>
-            <w:r>
-              <w:rPr>
-                <w:rFonts w:ascii="Times New Roman" w:hAnsi="Times New Roman"/>
-                <w:sz w:val="20"/>
-              </w:rPr>
-              <w:t>cyberlab-kali-attacker</w:t>
-            </w:r>
-          </w:p>
-        </w:tc>
-        <w:tc>
-          <w:tcPr>
-            <w:tcW w:type="dxa" w:w="1296"/>
-          </w:tcPr>
-          <w:p>
-            <w:pPr>
-              <w:spacing w:before="40" w:after="40"/>
-              <w:jc w:val="left"/>
-            </w:pPr>
-            <w:r>
-              <w:rPr>
-                <w:rFonts w:ascii="Times New Roman" w:hAnsi="Times New Roman"/>
-                <w:sz w:val="20"/>
-              </w:rPr>
-              <w:t>KVM (pve)</w:t>
-            </w:r>
-          </w:p>
-        </w:tc>
-        <w:tc>
-          <w:tcPr>
-            <w:tcW w:type="dxa" w:w="1296"/>
-          </w:tcPr>
-          <w:p>
-            <w:pPr>
-              <w:spacing w:before="40" w:after="40"/>
-              <w:jc w:val="left"/>
-            </w:pPr>
-            <w:r>
-              <w:rPr>
-                <w:rFonts w:ascii="Times New Roman" w:hAnsi="Times New Roman"/>
-                <w:sz w:val="20"/>
-              </w:rPr>
-              <w:t>Kali Linux 2024.1</w:t>
-            </w:r>
-          </w:p>
-        </w:tc>
-        <w:tc>
-          <w:tcPr>
-            <w:tcW w:type="dxa" w:w="1296"/>
-          </w:tcPr>
-          <w:p>
-            <w:pPr>
-              <w:spacing w:before="40" w:after="40"/>
-              <w:jc w:val="left"/>
-            </w:pPr>
-            <w:r>
-              <w:rPr>
-                <w:rFonts w:ascii="Times New Roman" w:hAnsi="Times New Roman"/>
-                <w:sz w:val="20"/>
-              </w:rPr>
-              <w:t>4 vCPU / 8 GB (fix)</w:t>
-            </w:r>
-          </w:p>
-        </w:tc>
-        <w:tc>
-          <w:tcPr>
-            <w:tcW w:type="dxa" w:w="1296"/>
-          </w:tcPr>
-          <w:p>
-            <w:pPr>
-              <w:spacing w:before="40" w:after="40"/>
-              <w:jc w:val="left"/>
-            </w:pPr>
-            <w:r>
-              <w:rPr>
-                <w:rFonts w:ascii="Times New Roman" w:hAnsi="Times New Roman"/>
-                <w:sz w:val="20"/>
-              </w:rPr>
-              <w:t>60 GB SSD</w:t>
-            </w:r>
-          </w:p>
-        </w:tc>
-        <w:tc>
-          <w:tcPr>
-            <w:tcW w:type="dxa" w:w="1296"/>
-          </w:tcPr>
-          <w:p>
-            <w:pPr>
-              <w:spacing w:before="40" w:after="40"/>
-              <w:jc w:val="left"/>
-            </w:pPr>
-            <w:r>
-              <w:rPr>
-                <w:rFonts w:ascii="Times New Roman" w:hAnsi="Times New Roman"/>
-                <w:sz w:val="20"/>
-              </w:rPr>
-              <w:t>Nod ofensiv Red Team pentru simularea atacurilor</w:t>
+              <w:t>Terminal tranzacțional securizat casierie/kiosk (VLAN 20/30)</w:t>
             </w:r>
           </w:p>
         </w:tc>

</xml_diff>